<commit_message>
Update release notes through 858a6d0
Covers the 9 commits since the last update: the single-Menu nav
collapse, the "<- Back" consistency pass, clickable dashboard KPI
cards plus the new /health-events and /vaccinations pages, the Soft
Neutral + Accent palette, the header wordmark's badge treatment (and
the stuck "Logging out..." fix along the way), and the security audit
(headers/CSP, migration 0009's search_path pinning, dependency
updates). New sections 3.12-3.13; routes table now lists 20 routes;
migrations table adds 0009; commit history, verification, and phone-
testing sections all refreshed.

Co-Authored-By: Claude Sonnet 5 <noreply@anthropic.com>
</commit_message>
<xml_diff>
--- a/docs/release-notes/Ubulimi-V1-Release-Notes.docx
+++ b/docs/release-notes/Ubulimi-V1-Release-Notes.docx
@@ -59,7 +59,7 @@
           <w:sz w:val="18"/>
           <w:szCs w:val="18"/>
         </w:rPr>
-        <w:t xml:space="preserve">V1 + follow-ups · 10 September 2026 · main @ 4e05204</w:t>
+        <w:t xml:space="preserve">V1 + follow-ups · 17 September 2026 · main @ 858a6d0</w:t>
       </w:r>
     </w:p>
     <w:p>
@@ -125,7 +125,7 @@
         <w:spacing w:after="120"/>
       </w:pPr>
       <w:r>
-        <w:t xml:space="preserve">V1 delivers the first working version of every core record-keeping area — nine build increments on top of the starter project (authentication, the database schema, and the two role-based landing pages already existed). Follow-up work since then — a Financials report, sale-integrity guards, grouped navigation, millilitre-based treatment dosing, label dosage reference data, and a health-event detail page — is described in sections 3.9 to 3.11; this document has been updated to include it.</w:t>
+        <w:t xml:space="preserve">V1 delivers the first working version of every core record-keeping area — nine build increments on top of the starter project (authentication, the database schema, and the two role-based landing pages already existed). Follow-up work since then — a Financials report, sale-integrity guards, grouped navigation, millilitre-based treatment dosing, label dosage reference data, a health-event detail page, dedicated Health events and Vaccinations pages, a single-Menu nav, a Soft Neutral + Accent visual refresh, and a security hardening pass — is described in sections 3.9 to 3.13; this document has been updated to include it.</w:t>
       </w:r>
     </w:p>
     <w:p>
@@ -404,7 +404,7 @@
                 <w:sz w:val="22"/>
                 <w:szCs w:val="22"/>
               </w:rPr>
-              <w:t xml:space="preserve">9 September 2026 (this document updated 10 September)</w:t>
+              <w:t xml:space="preserve">9 September 2026 (this document last updated 17 September)</w:t>
             </w:r>
           </w:p>
         </w:tc>
@@ -459,7 +459,7 @@
                 <w:sz w:val="22"/>
                 <w:szCs w:val="22"/>
               </w:rPr>
-              <w:t xml:space="preserve">github.com/hlongstibos/ubulimi (branch main, tip 4e05204)</w:t>
+              <w:t xml:space="preserve">github.com/hlongstibos/ubulimi (branch main, tip 858a6d0)</w:t>
             </w:r>
           </w:p>
         </w:tc>
@@ -569,7 +569,7 @@
                 <w:sz w:val="22"/>
                 <w:szCs w:val="22"/>
               </w:rPr>
-              <w:t xml:space="preserve">30 (9ab30fa … 4e05204) — 9 for V1, 21 follow-ups</w:t>
+              <w:t xml:space="preserve">39 (9ab30fa … 858a6d0) — 9 for V1, 30 follow-ups</w:t>
             </w:r>
           </w:p>
         </w:tc>
@@ -624,7 +624,7 @@
                 <w:sz w:val="22"/>
                 <w:szCs w:val="22"/>
               </w:rPr>
-              <w:t xml:space="preserve">0002 – 0008 — all applied to the live database (checked by API probe)</w:t>
+              <w:t xml:space="preserve">0002 – 0009 — all applied to the live database (checked live: API probe for 0002-0008, a full functional re-test of every RPC for 0009)</w:t>
             </w:r>
           </w:p>
         </w:tc>
@@ -679,7 +679,7 @@
                 <w:sz w:val="22"/>
                 <w:szCs w:val="22"/>
               </w:rPr>
-              <w:t xml:space="preserve">18 (see section 4)</w:t>
+              <w:t xml:space="preserve">20 (see section 4)</w:t>
             </w:r>
           </w:p>
         </w:tc>
@@ -1868,6 +1868,204 @@
       </w:r>
       <w:r>
         <w:t xml:space="preserve">Clicking a health event — from the Recent activity list on the dashboard / today view, or a Health event row in the animal history timeline — opens a page showing its symptoms, notes and status (Open / “Open · being treated” when a treatment exists / Resolved) with a Mark resolved / Reopen toggle, the animal linked, the list of treatments recorded against it, and a Record a treatment form (medicine picker + the same dosage guidance + dose in ml) so a treatment can be added after the event is first logged.</w:t>
+      </w:r>
+    </w:p>
+    <w:p>
+      <w:pPr>
+        <w:pStyle w:val="Heading2"/>
+        <w:spacing w:after="100" w:before="220"/>
+      </w:pPr>
+      <w:r>
+        <w:t xml:space="preserve">3.12  Navigation, revisited</w:t>
+      </w:r>
+    </w:p>
+    <w:p>
+      <w:pPr>
+        <w:pStyle w:val="ListParagraph"/>
+        <w:numPr>
+          <w:ilvl w:val="0"/>
+          <w:numId w:val="2"/>
+        </w:numPr>
+        <w:spacing w:after="80"/>
+      </w:pPr>
+      <w:r>
+        <w:rPr>
+          <w:b/>
+          <w:bCs/>
+        </w:rPr>
+        <w:t xml:space="preserve">Single Menu button. </w:t>
+      </w:r>
+      <w:r>
+        <w:t xml:space="preserve">The four dropdown pills described in 3.10 (Log / Herd / Stock / Setup) plus the Financials pill are gone — replaced with one “☰ Menu” button on the left, under the farm name, on the dashboard, today and financials pages. Clicking it opens a single panel with every section stacked (grouped by heading) instead of several controls competing for space.</w:t>
+      </w:r>
+    </w:p>
+    <w:p>
+      <w:pPr>
+        <w:pStyle w:val="ListParagraph"/>
+        <w:numPr>
+          <w:ilvl w:val="0"/>
+          <w:numId w:val="2"/>
+        </w:numPr>
+        <w:spacing w:after="80"/>
+      </w:pPr>
+      <w:r>
+        <w:rPr>
+          <w:b/>
+          <w:bCs/>
+        </w:rPr>
+        <w:t xml:space="preserve">A consistent “← Back” everywhere. </w:t>
+      </w:r>
+      <w:r>
+        <w:t xml:space="preserve">Getting back to the dashboard used to only reliably work by clicking the UBULIMI header badge. Every top-level list page (Animals, Medicine, Feed, Health events, Vaccinations, Vaccination types) now also carries the same small “← Back” link already used on the three log-* pages — role-aware (owner → /dashboard, worker → /today) — positioned the same way, above the title. Detail pages already had an equivalent “← [parent]” link; the chain from any page now reaches the dashboard in one consistent style.</w:t>
+      </w:r>
+    </w:p>
+    <w:p>
+      <w:pPr>
+        <w:pStyle w:val="ListParagraph"/>
+        <w:numPr>
+          <w:ilvl w:val="0"/>
+          <w:numId w:val="2"/>
+        </w:numPr>
+        <w:spacing w:after="80"/>
+      </w:pPr>
+      <w:r>
+        <w:rPr>
+          <w:b/>
+          <w:bCs/>
+        </w:rPr>
+        <w:t xml:space="preserve">Dashboard KPI cards are now links. </w:t>
+      </w:r>
+      <w:r>
+        <w:t xml:space="preserve">Animals on farm → /animals and Low-stock medicines → /medicine (real navigation). Open health events → the new /health-events list (below). Vaccinations due → the new /vaccinations page (below). The dashboard’s own “Due &amp; overdue vaccinations” and “Recent activity” collapsibles are unchanged, kept as quick access on the dashboard itself.</w:t>
+      </w:r>
+    </w:p>
+    <w:p>
+      <w:pPr>
+        <w:pStyle w:val="ListParagraph"/>
+        <w:numPr>
+          <w:ilvl w:val="0"/>
+          <w:numId w:val="2"/>
+        </w:numPr>
+        <w:spacing w:after="80"/>
+      </w:pPr>
+      <w:r>
+        <w:rPr>
+          <w:b/>
+          <w:bCs/>
+        </w:rPr>
+        <w:t xml:space="preserve">Health events (/health-events). </w:t>
+      </w:r>
+      <w:r>
+        <w:t xml:space="preserve">A full list of every health event on the farm, filterable Open / Resolved / All with live counts, each row showing the animal, symptom chips, status (Open / “Open · being treated” / Resolved), notes and date, linking to the existing /health-events/[id] detail page.</w:t>
+      </w:r>
+    </w:p>
+    <w:p>
+      <w:pPr>
+        <w:pStyle w:val="ListParagraph"/>
+        <w:numPr>
+          <w:ilvl w:val="0"/>
+          <w:numId w:val="2"/>
+        </w:numPr>
+        <w:spacing w:after="80"/>
+      </w:pPr>
+      <w:r>
+        <w:rPr>
+          <w:b/>
+          <w:bCs/>
+        </w:rPr>
+        <w:t xml:space="preserve">Vaccinations (/vaccinations). </w:t>
+      </w:r>
+      <w:r>
+        <w:t xml:space="preserve">The full due &amp; overdue list as a standalone page (not just the dashboard’s collapsed preview), with a “Set up vaccination types” button top-right, linking to /vaccination-types — shown only for owners.</w:t>
+      </w:r>
+    </w:p>
+    <w:p>
+      <w:pPr>
+        <w:pStyle w:val="Heading2"/>
+        <w:spacing w:after="100" w:before="220"/>
+      </w:pPr>
+      <w:r>
+        <w:t xml:space="preserve">3.13  Visual refresh and a security hardening pass</w:t>
+      </w:r>
+    </w:p>
+    <w:p>
+      <w:pPr>
+        <w:pStyle w:val="ListParagraph"/>
+        <w:numPr>
+          <w:ilvl w:val="0"/>
+          <w:numId w:val="2"/>
+        </w:numPr>
+        <w:spacing w:after="80"/>
+      </w:pPr>
+      <w:r>
+        <w:rPr>
+          <w:b/>
+          <w:bCs/>
+        </w:rPr>
+        <w:t xml:space="preserve">Soft Neutral + Accent palette. </w:t>
+      </w:r>
+      <w:r>
+        <w:t xml:space="preserve">The background, card borders and text were all lightly green-tinted, which muddied the two accent colours (forest, terracotta) into the rest of the UI. Neutralised the base to warm stone/gray — background, borders, muted/dark text, the card shadow, placeholder text, table/summary hover washes — while leaving the accent colours untouched, so they now read as deliberate against a calmer backdrop. The two @react-pdf/renderer report generators (animal history, financials), which hardcode their own palette since they can’t read CSS variables, were updated to match so a downloaded report looks consistent with the app.</w:t>
+      </w:r>
+    </w:p>
+    <w:p>
+      <w:pPr>
+        <w:pStyle w:val="ListParagraph"/>
+        <w:numPr>
+          <w:ilvl w:val="0"/>
+          <w:numId w:val="2"/>
+        </w:numPr>
+        <w:spacing w:after="80"/>
+      </w:pPr>
+      <w:r>
+        <w:rPr>
+          <w:b/>
+          <w:bCs/>
+        </w:rPr>
+        <w:t xml:space="preserve">Header wordmark. </w:t>
+      </w:r>
+      <w:r>
+        <w:t xml:space="preserve">Superseding the plain sticky-header text described in 3.9: UBULIMI is now a solid forest-green rounded badge with a subtle drop shadow, popping off the header instead of needing to visually match the Log out pill next to it.</w:t>
+      </w:r>
+    </w:p>
+    <w:p>
+      <w:pPr>
+        <w:pStyle w:val="ListParagraph"/>
+        <w:numPr>
+          <w:ilvl w:val="0"/>
+          <w:numId w:val="2"/>
+        </w:numPr>
+        <w:spacing w:after="80"/>
+      </w:pPr>
+      <w:r>
+        <w:rPr>
+          <w:b/>
+          <w:bCs/>
+        </w:rPr>
+        <w:t xml:space="preserve">Fixed a stuck “Logging out…” state. </w:t>
+      </w:r>
+      <w:r>
+        <w:t xml:space="preserve">AppHeader lives in the root layout and never truly unmounts — it renders null on /login and /, but the component instance (and its state) persists underneath. The logging-out flag was never reset on success, so after one logout the button would come back reading “Logging out…” (and stay disabled) the next time someone signed back in, even though nothing was in flight. Wrapped the logout call in try/finally so the flag always resets.</w:t>
+      </w:r>
+    </w:p>
+    <w:p>
+      <w:pPr>
+        <w:pStyle w:val="ListParagraph"/>
+        <w:numPr>
+          <w:ilvl w:val="0"/>
+          <w:numId w:val="2"/>
+        </w:numPr>
+        <w:spacing w:after="80"/>
+      </w:pPr>
+      <w:r>
+        <w:rPr>
+          <w:b/>
+          <w:bCs/>
+        </w:rPr>
+        <w:t xml:space="preserve">Security audit. </w:t>
+      </w:r>
+      <w:r>
+        <w:t xml:space="preserve">next.config.mjs had no response headers at all — added a Content-Security-Policy (default-src 'self', an explicit https://*.supabase.co connect-src allowlist, frame-ancestors 'none', object-src 'none'), X-Frame-Options, X-Content-Type-Options, Referrer-Policy, a locked-down Permissions-Policy, HSTS, and disabled X-Powered-By. Migration 0009 pins search_path = '' on all 8 SECURITY DEFINER functions, closing a gap Supabase’s own linter flags (safe here — every function already fully schema-qualifies its own references). Dependencies bumped within existing package.json ranges (Next, React/React-DOM + types); npm audit: 0 vulnerabilities before and after. Also reviewed and confirmed already sound: no secrets anywhere in git history, every table has RLS, every owner-only route redirects server-side (not just hidden in the UI), no custom API surface to secure or rate-limit, no dangerouslySetInnerHTML/eval/raw-SQL anywhere, and password storage is entirely Supabase Auth’s responsibility.</w:t>
       </w:r>
     </w:p>
     <w:p>
@@ -2572,7 +2770,7 @@
                 <w:sz w:val="20"/>
                 <w:szCs w:val="20"/>
               </w:rPr>
-              <w:t xml:space="preserve">/health-events/[id]</w:t>
+              <w:t xml:space="preserve">/health-events</w:t>
             </w:r>
           </w:p>
         </w:tc>
@@ -2622,7 +2820,7 @@
                 <w:sz w:val="22"/>
                 <w:szCs w:val="22"/>
               </w:rPr>
-              <w:t xml:space="preserve">Event symptoms / notes / status, treatments given, record a treatment</w:t>
+              <w:t xml:space="preserve">Filterable list (Open / Resolved / All) with counts</w:t>
             </w:r>
           </w:p>
         </w:tc>
@@ -2653,7 +2851,7 @@
                 <w:sz w:val="20"/>
                 <w:szCs w:val="20"/>
               </w:rPr>
-              <w:t xml:space="preserve">/camps</w:t>
+              <w:t xml:space="preserve">/health-events/[id]</w:t>
             </w:r>
           </w:p>
         </w:tc>
@@ -2703,7 +2901,7 @@
                 <w:sz w:val="22"/>
                 <w:szCs w:val="22"/>
               </w:rPr>
-              <w:t xml:space="preserve">Camp list + add</w:t>
+              <w:t xml:space="preserve">Event symptoms / notes / status, treatments given, record a treatment</w:t>
             </w:r>
           </w:p>
         </w:tc>
@@ -2734,7 +2932,7 @@
                 <w:sz w:val="20"/>
                 <w:szCs w:val="20"/>
               </w:rPr>
-              <w:t xml:space="preserve">/medicine</w:t>
+              <w:t xml:space="preserve">/vaccinations</w:t>
             </w:r>
           </w:p>
         </w:tc>
@@ -2784,7 +2982,7 @@
                 <w:sz w:val="22"/>
                 <w:szCs w:val="22"/>
               </w:rPr>
-              <w:t xml:space="preserve">Inventory first; collapsible add form (cost fields owner-only)</w:t>
+              <w:t xml:space="preserve">Full due &amp; overdue list; Set up vaccination types (owner)</w:t>
             </w:r>
           </w:p>
         </w:tc>
@@ -2815,7 +3013,7 @@
                 <w:sz w:val="20"/>
                 <w:szCs w:val="20"/>
               </w:rPr>
-              <w:t xml:space="preserve">/medicine/[id]</w:t>
+              <w:t xml:space="preserve">/camps</w:t>
             </w:r>
           </w:p>
         </w:tc>
@@ -2865,7 +3063,7 @@
                 <w:sz w:val="22"/>
                 <w:szCs w:val="22"/>
               </w:rPr>
-              <w:t xml:space="preserve">Edit medicine (cost/supplier owner-only)</w:t>
+              <w:t xml:space="preserve">Camp list + add</w:t>
             </w:r>
           </w:p>
         </w:tc>
@@ -2896,7 +3094,7 @@
                 <w:sz w:val="20"/>
                 <w:szCs w:val="20"/>
               </w:rPr>
-              <w:t xml:space="preserve">/feed</w:t>
+              <w:t xml:space="preserve">/medicine</w:t>
             </w:r>
           </w:p>
         </w:tc>
@@ -2946,7 +3144,7 @@
                 <w:sz w:val="22"/>
                 <w:szCs w:val="22"/>
               </w:rPr>
-              <w:t xml:space="preserve">Inventory first; collapsible add form</w:t>
+              <w:t xml:space="preserve">Inventory first; collapsible add form (cost fields owner-only)</w:t>
             </w:r>
           </w:p>
         </w:tc>
@@ -2977,7 +3175,7 @@
                 <w:sz w:val="20"/>
                 <w:szCs w:val="20"/>
               </w:rPr>
-              <w:t xml:space="preserve">/feed/[id]</w:t>
+              <w:t xml:space="preserve">/medicine/[id]</w:t>
             </w:r>
           </w:p>
         </w:tc>
@@ -3027,7 +3225,7 @@
                 <w:sz w:val="22"/>
                 <w:szCs w:val="22"/>
               </w:rPr>
-              <w:t xml:space="preserve">Edit feed</w:t>
+              <w:t xml:space="preserve">Edit medicine (cost/supplier owner-only)</w:t>
             </w:r>
           </w:p>
         </w:tc>
@@ -3058,7 +3256,7 @@
                 <w:sz w:val="20"/>
                 <w:szCs w:val="20"/>
               </w:rPr>
-              <w:t xml:space="preserve">/log-event</w:t>
+              <w:t xml:space="preserve">/feed</w:t>
             </w:r>
           </w:p>
         </w:tc>
@@ -3108,7 +3306,7 @@
                 <w:sz w:val="22"/>
                 <w:szCs w:val="22"/>
               </w:rPr>
-              <w:t xml:space="preserve">Health event + medicine suggestions + optional treatment</w:t>
+              <w:t xml:space="preserve">Inventory first; collapsible add form</w:t>
             </w:r>
           </w:p>
         </w:tc>
@@ -3139,7 +3337,7 @@
                 <w:sz w:val="20"/>
                 <w:szCs w:val="20"/>
               </w:rPr>
-              <w:t xml:space="preserve">/log-vaccination</w:t>
+              <w:t xml:space="preserve">/feed/[id]</w:t>
             </w:r>
           </w:p>
         </w:tc>
@@ -3189,7 +3387,7 @@
                 <w:sz w:val="22"/>
                 <w:szCs w:val="22"/>
               </w:rPr>
-              <w:t xml:space="preserve">Animal + type → vaccination record</w:t>
+              <w:t xml:space="preserve">Edit feed</w:t>
             </w:r>
           </w:p>
         </w:tc>
@@ -3220,7 +3418,7 @@
                 <w:sz w:val="20"/>
                 <w:szCs w:val="20"/>
               </w:rPr>
-              <w:t xml:space="preserve">/log-feeding</w:t>
+              <w:t xml:space="preserve">/log-event</w:t>
             </w:r>
           </w:p>
         </w:tc>
@@ -3270,7 +3468,7 @@
                 <w:sz w:val="22"/>
                 <w:szCs w:val="22"/>
               </w:rPr>
-              <w:t xml:space="preserve">Camp + feed + quantity</w:t>
+              <w:t xml:space="preserve">Health event + medicine suggestions + optional treatment</w:t>
             </w:r>
           </w:p>
         </w:tc>
@@ -3301,7 +3499,7 @@
                 <w:sz w:val="20"/>
                 <w:szCs w:val="20"/>
               </w:rPr>
-              <w:t xml:space="preserve">/vaccination-types</w:t>
+              <w:t xml:space="preserve">/log-vaccination</w:t>
             </w:r>
           </w:p>
         </w:tc>
@@ -3326,7 +3524,7 @@
                 <w:sz w:val="22"/>
                 <w:szCs w:val="22"/>
               </w:rPr>
-              <w:t xml:space="preserve">Owner</w:t>
+              <w:t xml:space="preserve">Both</w:t>
             </w:r>
           </w:p>
         </w:tc>
@@ -3351,7 +3549,7 @@
                 <w:sz w:val="22"/>
                 <w:szCs w:val="22"/>
               </w:rPr>
-              <w:t xml:space="preserve">Vaccination type setup list + add</w:t>
+              <w:t xml:space="preserve">Animal + type → vaccination record</w:t>
             </w:r>
           </w:p>
         </w:tc>
@@ -3382,6 +3580,168 @@
                 <w:sz w:val="20"/>
                 <w:szCs w:val="20"/>
               </w:rPr>
+              <w:t xml:space="preserve">/log-feeding</w:t>
+            </w:r>
+          </w:p>
+        </w:tc>
+        <w:tc>
+          <w:tcPr>
+            <w:tcW w:type="dxa" w:w="1700"/>
+            <w:tcMar>
+              <w:top w:type="dxa" w:w="60"/>
+              <w:left w:type="dxa" w:w="100"/>
+              <w:bottom w:type="dxa" w:w="60"/>
+              <w:right w:type="dxa" w:w="100"/>
+            </w:tcMar>
+          </w:tcPr>
+          <w:p>
+            <w:pPr>
+              <w:spacing w:after="0"/>
+            </w:pPr>
+            <w:r>
+              <w:rPr>
+                <w:b w:val="false"/>
+                <w:bCs w:val="false"/>
+                <w:sz w:val="22"/>
+                <w:szCs w:val="22"/>
+              </w:rPr>
+              <w:t xml:space="preserve">Both</w:t>
+            </w:r>
+          </w:p>
+        </w:tc>
+        <w:tc>
+          <w:tcPr>
+            <w:tcW w:type="dxa" w:w="4720"/>
+            <w:tcMar>
+              <w:top w:type="dxa" w:w="60"/>
+              <w:left w:type="dxa" w:w="100"/>
+              <w:bottom w:type="dxa" w:w="60"/>
+              <w:right w:type="dxa" w:w="100"/>
+            </w:tcMar>
+          </w:tcPr>
+          <w:p>
+            <w:pPr>
+              <w:spacing w:after="0"/>
+            </w:pPr>
+            <w:r>
+              <w:rPr>
+                <w:b w:val="false"/>
+                <w:bCs w:val="false"/>
+                <w:sz w:val="22"/>
+                <w:szCs w:val="22"/>
+              </w:rPr>
+              <w:t xml:space="preserve">Camp + feed + quantity</w:t>
+            </w:r>
+          </w:p>
+        </w:tc>
+      </w:tr>
+      <w:tr>
+        <w:trPr>
+          <w:tblHeader w:val="false"/>
+        </w:trPr>
+        <w:tc>
+          <w:tcPr>
+            <w:tcW w:type="dxa" w:w="2600"/>
+            <w:tcMar>
+              <w:top w:type="dxa" w:w="60"/>
+              <w:left w:type="dxa" w:w="100"/>
+              <w:bottom w:type="dxa" w:w="60"/>
+              <w:right w:type="dxa" w:w="100"/>
+            </w:tcMar>
+          </w:tcPr>
+          <w:p>
+            <w:pPr>
+              <w:spacing w:after="0"/>
+            </w:pPr>
+            <w:r>
+              <w:rPr>
+                <w:rFonts w:ascii="Consolas" w:cs="Consolas" w:eastAsia="Consolas" w:hAnsi="Consolas"/>
+                <w:b w:val="false"/>
+                <w:bCs w:val="false"/>
+                <w:sz w:val="20"/>
+                <w:szCs w:val="20"/>
+              </w:rPr>
+              <w:t xml:space="preserve">/vaccination-types</w:t>
+            </w:r>
+          </w:p>
+        </w:tc>
+        <w:tc>
+          <w:tcPr>
+            <w:tcW w:type="dxa" w:w="1700"/>
+            <w:tcMar>
+              <w:top w:type="dxa" w:w="60"/>
+              <w:left w:type="dxa" w:w="100"/>
+              <w:bottom w:type="dxa" w:w="60"/>
+              <w:right w:type="dxa" w:w="100"/>
+            </w:tcMar>
+          </w:tcPr>
+          <w:p>
+            <w:pPr>
+              <w:spacing w:after="0"/>
+            </w:pPr>
+            <w:r>
+              <w:rPr>
+                <w:b w:val="false"/>
+                <w:bCs w:val="false"/>
+                <w:sz w:val="22"/>
+                <w:szCs w:val="22"/>
+              </w:rPr>
+              <w:t xml:space="preserve">Owner</w:t>
+            </w:r>
+          </w:p>
+        </w:tc>
+        <w:tc>
+          <w:tcPr>
+            <w:tcW w:type="dxa" w:w="4720"/>
+            <w:tcMar>
+              <w:top w:type="dxa" w:w="60"/>
+              <w:left w:type="dxa" w:w="100"/>
+              <w:bottom w:type="dxa" w:w="60"/>
+              <w:right w:type="dxa" w:w="100"/>
+            </w:tcMar>
+          </w:tcPr>
+          <w:p>
+            <w:pPr>
+              <w:spacing w:after="0"/>
+            </w:pPr>
+            <w:r>
+              <w:rPr>
+                <w:b w:val="false"/>
+                <w:bCs w:val="false"/>
+                <w:sz w:val="22"/>
+                <w:szCs w:val="22"/>
+              </w:rPr>
+              <w:t xml:space="preserve">Vaccination type setup list + add</w:t>
+            </w:r>
+          </w:p>
+        </w:tc>
+      </w:tr>
+      <w:tr>
+        <w:trPr>
+          <w:tblHeader w:val="false"/>
+        </w:trPr>
+        <w:tc>
+          <w:tcPr>
+            <w:tcW w:type="dxa" w:w="2600"/>
+            <w:tcMar>
+              <w:top w:type="dxa" w:w="60"/>
+              <w:left w:type="dxa" w:w="100"/>
+              <w:bottom w:type="dxa" w:w="60"/>
+              <w:right w:type="dxa" w:w="100"/>
+            </w:tcMar>
+          </w:tcPr>
+          <w:p>
+            <w:pPr>
+              <w:spacing w:after="0"/>
+            </w:pPr>
+            <w:r>
+              <w:rPr>
+                <w:rFonts w:ascii="Consolas" w:cs="Consolas" w:eastAsia="Consolas" w:hAnsi="Consolas"/>
+                <w:b w:val="false"/>
+                <w:bCs w:val="false"/>
+                <w:sz w:val="20"/>
+                <w:szCs w:val="20"/>
+              </w:rPr>
               <w:t xml:space="preserve">/vaccination-types/[id]</w:t>
             </w:r>
           </w:p>
@@ -3452,7 +3812,7 @@
         <w:spacing w:after="120"/>
       </w:pPr>
       <w:r>
-        <w:t xml:space="preserve">Seven migrations are new since the base schema. They must be run once in the Supabase SQL Editor, in order. Migration 0001 (the base schema) was already applied. All seven below have been confirmed live in the project database (checked by API probe).</w:t>
+        <w:t xml:space="preserve">Eight migrations are new since the base schema. They must be run once in the Supabase SQL Editor, in order. Migration 0001 (the base schema) was already applied. All eight below have been confirmed live in the project database.</w:t>
       </w:r>
     </w:p>
     <w:tbl>
@@ -3920,6 +4280,62 @@
           </w:p>
         </w:tc>
       </w:tr>
+      <w:tr>
+        <w:trPr>
+          <w:tblHeader w:val="false"/>
+        </w:trPr>
+        <w:tc>
+          <w:tcPr>
+            <w:tcW w:type="dxa" w:w="2700"/>
+            <w:tcMar>
+              <w:top w:type="dxa" w:w="60"/>
+              <w:left w:type="dxa" w:w="100"/>
+              <w:bottom w:type="dxa" w:w="60"/>
+              <w:right w:type="dxa" w:w="100"/>
+            </w:tcMar>
+          </w:tcPr>
+          <w:p>
+            <w:pPr>
+              <w:spacing w:after="0"/>
+            </w:pPr>
+            <w:r>
+              <w:rPr>
+                <w:rFonts w:ascii="Consolas" w:cs="Consolas" w:eastAsia="Consolas" w:hAnsi="Consolas"/>
+                <w:b w:val="false"/>
+                <w:bCs w:val="false"/>
+                <w:sz w:val="20"/>
+                <w:szCs w:val="20"/>
+              </w:rPr>
+              <w:t xml:space="preserve">0009_pin_search_path.sql</w:t>
+            </w:r>
+          </w:p>
+        </w:tc>
+        <w:tc>
+          <w:tcPr>
+            <w:tcW w:type="dxa" w:w="6320"/>
+            <w:tcMar>
+              <w:top w:type="dxa" w:w="60"/>
+              <w:left w:type="dxa" w:w="100"/>
+              <w:bottom w:type="dxa" w:w="60"/>
+              <w:right w:type="dxa" w:w="100"/>
+            </w:tcMar>
+          </w:tcPr>
+          <w:p>
+            <w:pPr>
+              <w:spacing w:after="0"/>
+            </w:pPr>
+            <w:r>
+              <w:rPr>
+                <w:b w:val="false"/>
+                <w:bCs w:val="false"/>
+                <w:sz w:val="22"/>
+                <w:szCs w:val="22"/>
+              </w:rPr>
+              <w:t xml:space="preserve">Security hardening: pins search_path = '' on all 8 SECURITY DEFINER functions (current_farm_id, current_role, log_audit_event, administer_treatment, administer_vaccination, log_feeding_event, record_sale, void_sale) — closes a search-path-hijacking gap. Configuration-only; no signature or behaviour change.</w:t>
+            </w:r>
+          </w:p>
+        </w:tc>
+      </w:tr>
     </w:tbl>
     <w:p>
       <w:pPr>
@@ -4274,149 +4690,15 @@
     </w:p>
     <w:p>
       <w:pPr>
-        <w:pStyle w:val="Heading1"/>
-        <w:spacing w:after="140" w:before="320"/>
-      </w:pPr>
-      <w:r>
-        <w:t xml:space="preserve">8. Known limitations and deferred work</w:t>
-      </w:r>
-    </w:p>
-    <w:p>
-      <w:pPr>
-        <w:pStyle w:val="Heading2"/>
-        <w:spacing w:after="100" w:before="220"/>
-      </w:pPr>
-      <w:r>
-        <w:t xml:space="preserve">Deferred</w:t>
-      </w:r>
-    </w:p>
-    <w:p>
-      <w:pPr>
-        <w:pStyle w:val="ListParagraph"/>
-        <w:numPr>
-          <w:ilvl w:val="0"/>
-          <w:numId w:val="2"/>
-        </w:numPr>
-        <w:spacing w:after="80"/>
-      </w:pPr>
-      <w:r>
-        <w:rPr>
-          <w:b/>
-          <w:bCs/>
-        </w:rPr>
-        <w:t xml:space="preserve">Offline support. </w:t>
-      </w:r>
-      <w:r>
-        <w:t xml:space="preserve">An IndexedDB queue for the health-event form was built and then withdrawn: the auth middleware revalidates the session over the network on every request, so any navigation while offline redirects to the login page. Usable offline behaviour needs the middleware to fall back to the stored session cookie plus caching of the page shell. Tracked as a follow-up; nothing offline-related ships in V1.</w:t>
-      </w:r>
-    </w:p>
-    <w:p>
-      <w:pPr>
-        <w:pStyle w:val="Heading2"/>
-        <w:spacing w:after="100" w:before="220"/>
-      </w:pPr>
-      <w:r>
-        <w:t xml:space="preserve">Behavioural notes</w:t>
-      </w:r>
-    </w:p>
-    <w:p>
-      <w:pPr>
-        <w:pStyle w:val="ListParagraph"/>
-        <w:numPr>
-          <w:ilvl w:val="0"/>
-          <w:numId w:val="2"/>
-        </w:numPr>
-        <w:spacing w:after="80"/>
-      </w:pPr>
-      <w:r>
-        <w:t xml:space="preserve">Vaccination applicability is an exact species-string match. “Cattle” does not match “cattle”, and a type with no target species set never applies to anything.</w:t>
-      </w:r>
-    </w:p>
-    <w:p>
-      <w:pPr>
-        <w:pStyle w:val="ListParagraph"/>
-        <w:numPr>
-          <w:ilvl w:val="0"/>
-          <w:numId w:val="2"/>
-        </w:numPr>
-        <w:spacing w:after="80"/>
-      </w:pPr>
-      <w:r>
-        <w:t xml:space="preserve">The Download Report PDF covers identity, vaccinations, treatments and sale — not the free-text health-event notes. The on-screen History timeline still shows those.</w:t>
-      </w:r>
-    </w:p>
-    <w:p>
-      <w:pPr>
-        <w:pStyle w:val="ListParagraph"/>
-        <w:numPr>
-          <w:ilvl w:val="0"/>
-          <w:numId w:val="2"/>
-        </w:numPr>
-        <w:spacing w:after="80"/>
-      </w:pPr>
-      <w:r>
-        <w:t xml:space="preserve">Financials: sales revenue and feed cost are exact; medicine &amp; vaccination cost is estimated at one unit / dose per record; labour, transport and other overheads are not tracked. Items with no cost captured count as R 0.</w:t>
-      </w:r>
-    </w:p>
-    <w:p>
-      <w:pPr>
-        <w:pStyle w:val="ListParagraph"/>
-        <w:numPr>
-          <w:ilvl w:val="0"/>
-          <w:numId w:val="2"/>
-        </w:numPr>
-        <w:spacing w:after="80"/>
-      </w:pPr>
-      <w:r>
-        <w:t xml:space="preserve">void_sale hard-deletes the sale row (the audit log records the deletion). There is no “voided” flag or soft-delete.</w:t>
-      </w:r>
-    </w:p>
-    <w:p>
-      <w:pPr>
-        <w:pStyle w:val="ListParagraph"/>
-        <w:numPr>
-          <w:ilvl w:val="0"/>
-          <w:numId w:val="2"/>
-        </w:numPr>
-        <w:spacing w:after="80"/>
-      </w:pPr>
-      <w:r>
-        <w:t xml:space="preserve">Medicine suggestions on the health-event form likewise need the symptom tag to exactly match a stored “treats condition” string. There is no fuzzy matching.</w:t>
-      </w:r>
-    </w:p>
-    <w:p>
-      <w:pPr>
-        <w:pStyle w:val="ListParagraph"/>
-        <w:numPr>
-          <w:ilvl w:val="0"/>
-          <w:numId w:val="2"/>
-        </w:numPr>
-        <w:spacing w:after="80"/>
-      </w:pPr>
-      <w:r>
-        <w:t xml:space="preserve">The animal history timeline is not paginated — fine for pilot volumes, revisit if an animal accumulates hundreds of events.</w:t>
-      </w:r>
-    </w:p>
-    <w:p>
-      <w:pPr>
-        <w:pStyle w:val="Heading2"/>
-        <w:spacing w:after="100" w:before="220"/>
-      </w:pPr>
-      <w:r>
-        <w:t xml:space="preserve">Inherited from the starter project</w:t>
-      </w:r>
-    </w:p>
-    <w:p>
-      <w:pPr>
-        <w:pStyle w:val="ListParagraph"/>
-        <w:numPr>
-          <w:ilvl w:val="0"/>
-          <w:numId w:val="2"/>
-        </w:numPr>
-        <w:spacing w:after="80"/>
-      </w:pPr>
-      <w:r>
-        <w:t xml:space="preserve">The </w:t>
+        <w:pStyle w:val="ListParagraph"/>
+        <w:numPr>
+          <w:ilvl w:val="0"/>
+          <w:numId w:val="2"/>
+        </w:numPr>
+        <w:spacing w:after="80"/>
+      </w:pPr>
+      <w:r>
+        <w:t xml:space="preserve">Response headers (</w:t>
       </w:r>
       <w:r>
         <w:rPr>
@@ -4424,10 +4706,23 @@
           <w:sz w:val="20"/>
           <w:szCs w:val="20"/>
         </w:rPr>
-        <w:t xml:space="preserve">npm run lint</w:t>
-      </w:r>
-      <w:r>
-        <w:t xml:space="preserve"> script is broken (</w:t>
+        <w:t xml:space="preserve">next.config.mjs</w:t>
+      </w:r>
+      <w:r>
+        <w:t xml:space="preserve">): Content-Security-Policy, X-Frame-Options, X-Content-Type-Options, Referrer-Policy, a locked-down Permissions-Policy, and HSTS; the framework's X-Powered-By header is suppressed.</w:t>
+      </w:r>
+    </w:p>
+    <w:p>
+      <w:pPr>
+        <w:pStyle w:val="ListParagraph"/>
+        <w:numPr>
+          <w:ilvl w:val="0"/>
+          <w:numId w:val="2"/>
+        </w:numPr>
+        <w:spacing w:after="80"/>
+      </w:pPr>
+      <w:r>
+        <w:t xml:space="preserve">Every </w:t>
       </w:r>
       <w:r>
         <w:rPr>
@@ -4435,31 +4730,168 @@
           <w:sz w:val="20"/>
           <w:szCs w:val="20"/>
         </w:rPr>
-        <w:t xml:space="preserve">next lint</w:t>
-      </w:r>
-      <w:r>
-        <w:t xml:space="preserve"> was removed in Next.js 16). The build-time TypeScript check still runs.</w:t>
-      </w:r>
-    </w:p>
-    <w:p>
-      <w:pPr>
-        <w:pStyle w:val="ListParagraph"/>
-        <w:numPr>
-          <w:ilvl w:val="0"/>
-          <w:numId w:val="2"/>
-        </w:numPr>
-        <w:spacing w:after="80"/>
-      </w:pPr>
+        <w:t xml:space="preserve">SECURITY DEFINER</w:t>
+      </w:r>
+      <w:r>
+        <w:t xml:space="preserve"> function pins </w:t>
+      </w:r>
       <w:r>
         <w:rPr>
           <w:rFonts w:ascii="Consolas" w:cs="Consolas" w:eastAsia="Consolas" w:hAnsi="Consolas"/>
           <w:sz w:val="20"/>
           <w:szCs w:val="20"/>
         </w:rPr>
-        <w:t xml:space="preserve">middleware.ts</w:t>
-      </w:r>
-      <w:r>
-        <w:t xml:space="preserve"> uses the file convention Next.js 16 has deprecated in favour of </w:t>
+        <w:t xml:space="preserve">search_path = ''</w:t>
+      </w:r>
+      <w:r>
+        <w:t xml:space="preserve"> (migration 0009), closing the search-path-hijacking gap Supabase's own linter flags for definer functions.</w:t>
+      </w:r>
+    </w:p>
+    <w:p>
+      <w:pPr>
+        <w:pStyle w:val="Heading1"/>
+        <w:spacing w:after="140" w:before="320"/>
+      </w:pPr>
+      <w:r>
+        <w:t xml:space="preserve">8. Known limitations and deferred work</w:t>
+      </w:r>
+    </w:p>
+    <w:p>
+      <w:pPr>
+        <w:pStyle w:val="Heading2"/>
+        <w:spacing w:after="100" w:before="220"/>
+      </w:pPr>
+      <w:r>
+        <w:t xml:space="preserve">Deferred</w:t>
+      </w:r>
+    </w:p>
+    <w:p>
+      <w:pPr>
+        <w:pStyle w:val="ListParagraph"/>
+        <w:numPr>
+          <w:ilvl w:val="0"/>
+          <w:numId w:val="2"/>
+        </w:numPr>
+        <w:spacing w:after="80"/>
+      </w:pPr>
+      <w:r>
+        <w:rPr>
+          <w:b/>
+          <w:bCs/>
+        </w:rPr>
+        <w:t xml:space="preserve">Offline support. </w:t>
+      </w:r>
+      <w:r>
+        <w:t xml:space="preserve">An IndexedDB queue for the health-event form was built and then withdrawn: the auth middleware revalidates the session over the network on every request, so any navigation while offline redirects to the login page. Usable offline behaviour needs the middleware to fall back to the stored session cookie plus caching of the page shell. Tracked as a follow-up; nothing offline-related ships in V1.</w:t>
+      </w:r>
+    </w:p>
+    <w:p>
+      <w:pPr>
+        <w:pStyle w:val="Heading2"/>
+        <w:spacing w:after="100" w:before="220"/>
+      </w:pPr>
+      <w:r>
+        <w:t xml:space="preserve">Behavioural notes</w:t>
+      </w:r>
+    </w:p>
+    <w:p>
+      <w:pPr>
+        <w:pStyle w:val="ListParagraph"/>
+        <w:numPr>
+          <w:ilvl w:val="0"/>
+          <w:numId w:val="2"/>
+        </w:numPr>
+        <w:spacing w:after="80"/>
+      </w:pPr>
+      <w:r>
+        <w:t xml:space="preserve">Vaccination applicability is an exact species-string match. “Cattle” does not match “cattle”, and a type with no target species set never applies to anything.</w:t>
+      </w:r>
+    </w:p>
+    <w:p>
+      <w:pPr>
+        <w:pStyle w:val="ListParagraph"/>
+        <w:numPr>
+          <w:ilvl w:val="0"/>
+          <w:numId w:val="2"/>
+        </w:numPr>
+        <w:spacing w:after="80"/>
+      </w:pPr>
+      <w:r>
+        <w:t xml:space="preserve">The Download Report PDF covers identity, vaccinations, treatments and sale — not the free-text health-event notes. The on-screen History timeline still shows those.</w:t>
+      </w:r>
+    </w:p>
+    <w:p>
+      <w:pPr>
+        <w:pStyle w:val="ListParagraph"/>
+        <w:numPr>
+          <w:ilvl w:val="0"/>
+          <w:numId w:val="2"/>
+        </w:numPr>
+        <w:spacing w:after="80"/>
+      </w:pPr>
+      <w:r>
+        <w:t xml:space="preserve">Financials: sales revenue and feed cost are exact; medicine &amp; vaccination cost is estimated at one unit / dose per record; labour, transport and other overheads are not tracked. Items with no cost captured count as R 0.</w:t>
+      </w:r>
+    </w:p>
+    <w:p>
+      <w:pPr>
+        <w:pStyle w:val="ListParagraph"/>
+        <w:numPr>
+          <w:ilvl w:val="0"/>
+          <w:numId w:val="2"/>
+        </w:numPr>
+        <w:spacing w:after="80"/>
+      </w:pPr>
+      <w:r>
+        <w:t xml:space="preserve">void_sale hard-deletes the sale row (the audit log records the deletion). There is no “voided” flag or soft-delete.</w:t>
+      </w:r>
+    </w:p>
+    <w:p>
+      <w:pPr>
+        <w:pStyle w:val="ListParagraph"/>
+        <w:numPr>
+          <w:ilvl w:val="0"/>
+          <w:numId w:val="2"/>
+        </w:numPr>
+        <w:spacing w:after="80"/>
+      </w:pPr>
+      <w:r>
+        <w:t xml:space="preserve">Medicine suggestions on the health-event form likewise need the symptom tag to exactly match a stored “treats condition” string. There is no fuzzy matching.</w:t>
+      </w:r>
+    </w:p>
+    <w:p>
+      <w:pPr>
+        <w:pStyle w:val="ListParagraph"/>
+        <w:numPr>
+          <w:ilvl w:val="0"/>
+          <w:numId w:val="2"/>
+        </w:numPr>
+        <w:spacing w:after="80"/>
+      </w:pPr>
+      <w:r>
+        <w:t xml:space="preserve">The animal history timeline is not paginated — fine for pilot volumes, revisit if an animal accumulates hundreds of events.</w:t>
+      </w:r>
+    </w:p>
+    <w:p>
+      <w:pPr>
+        <w:pStyle w:val="Heading2"/>
+        <w:spacing w:after="100" w:before="220"/>
+      </w:pPr>
+      <w:r>
+        <w:t xml:space="preserve">Inherited from the starter project</w:t>
+      </w:r>
+    </w:p>
+    <w:p>
+      <w:pPr>
+        <w:pStyle w:val="ListParagraph"/>
+        <w:numPr>
+          <w:ilvl w:val="0"/>
+          <w:numId w:val="2"/>
+        </w:numPr>
+        <w:spacing w:after="80"/>
+      </w:pPr>
+      <w:r>
+        <w:t xml:space="preserve">The </w:t>
       </w:r>
       <w:r>
         <w:rPr>
@@ -4467,32 +4899,10 @@
           <w:sz w:val="20"/>
           <w:szCs w:val="20"/>
         </w:rPr>
-        <w:t xml:space="preserve">proxy.ts</w:t>
-      </w:r>
-      <w:r>
-        <w:t xml:space="preserve">. It works and only emits a warning.</w:t>
-      </w:r>
-    </w:p>
-    <w:p>
-      <w:pPr>
-        <w:pStyle w:val="Heading1"/>
-        <w:spacing w:after="140" w:before="320"/>
-      </w:pPr>
-      <w:r>
-        <w:t xml:space="preserve">9. Deployment and operator checklist</w:t>
-      </w:r>
-    </w:p>
-    <w:p>
-      <w:pPr>
-        <w:pStyle w:val="ListParagraph"/>
-        <w:numPr>
-          <w:ilvl w:val="0"/>
-          <w:numId w:val="2"/>
-        </w:numPr>
-        <w:spacing w:after="80"/>
-      </w:pPr>
-      <w:r>
-        <w:t xml:space="preserve">1.  Apply migrations </w:t>
+        <w:t xml:space="preserve">npm run lint</w:t>
+      </w:r>
+      <w:r>
+        <w:t xml:space="preserve"> script is broken (</w:t>
       </w:r>
       <w:r>
         <w:rPr>
@@ -4500,27 +4910,92 @@
           <w:sz w:val="20"/>
           <w:szCs w:val="20"/>
         </w:rPr>
-        <w:t xml:space="preserve">0002</w:t>
-      </w:r>
-      <w:r>
-        <w:t xml:space="preserve"> through </w:t>
-      </w:r>
+        <w:t xml:space="preserve">next lint</w:t>
+      </w:r>
+      <w:r>
+        <w:t xml:space="preserve"> was removed in Next.js 16). The build-time TypeScript check still runs.</w:t>
+      </w:r>
+    </w:p>
+    <w:p>
+      <w:pPr>
+        <w:pStyle w:val="ListParagraph"/>
+        <w:numPr>
+          <w:ilvl w:val="0"/>
+          <w:numId w:val="2"/>
+        </w:numPr>
+        <w:spacing w:after="80"/>
+      </w:pPr>
       <w:r>
         <w:rPr>
           <w:rFonts w:ascii="Consolas" w:cs="Consolas" w:eastAsia="Consolas" w:hAnsi="Consolas"/>
           <w:sz w:val="20"/>
           <w:szCs w:val="20"/>
         </w:rPr>
-        <w:t xml:space="preserve">0008</w:t>
-      </w:r>
-      <w:r>
-        <w:t xml:space="preserve"> in the Supabase SQL Editor, in order. Run 0007 together with the matching frontend deploy — it changes the administer_treatment signature.  </w:t>
+        <w:t xml:space="preserve">middleware.ts</w:t>
+      </w:r>
+      <w:r>
+        <w:t xml:space="preserve"> uses the file convention Next.js 16 has deprecated in favour of </w:t>
+      </w:r>
+      <w:r>
+        <w:rPr>
+          <w:rFonts w:ascii="Consolas" w:cs="Consolas" w:eastAsia="Consolas" w:hAnsi="Consolas"/>
+          <w:sz w:val="20"/>
+          <w:szCs w:val="20"/>
+        </w:rPr>
+        <w:t xml:space="preserve">proxy.ts</w:t>
+      </w:r>
+      <w:r>
+        <w:t xml:space="preserve">. It works and only emits a warning.</w:t>
+      </w:r>
+    </w:p>
+    <w:p>
+      <w:pPr>
+        <w:pStyle w:val="Heading1"/>
+        <w:spacing w:after="140" w:before="320"/>
+      </w:pPr>
+      <w:r>
+        <w:t xml:space="preserve">9. Deployment and operator checklist</w:t>
+      </w:r>
+    </w:p>
+    <w:p>
+      <w:pPr>
+        <w:pStyle w:val="ListParagraph"/>
+        <w:numPr>
+          <w:ilvl w:val="0"/>
+          <w:numId w:val="2"/>
+        </w:numPr>
+        <w:spacing w:after="80"/>
+      </w:pPr>
+      <w:r>
+        <w:t xml:space="preserve">1.  Apply migrations </w:t>
+      </w:r>
+      <w:r>
+        <w:rPr>
+          <w:rFonts w:ascii="Consolas" w:cs="Consolas" w:eastAsia="Consolas" w:hAnsi="Consolas"/>
+          <w:sz w:val="20"/>
+          <w:szCs w:val="20"/>
+        </w:rPr>
+        <w:t xml:space="preserve">0002</w:t>
+      </w:r>
+      <w:r>
+        <w:t xml:space="preserve"> through </w:t>
+      </w:r>
+      <w:r>
+        <w:rPr>
+          <w:rFonts w:ascii="Consolas" w:cs="Consolas" w:eastAsia="Consolas" w:hAnsi="Consolas"/>
+          <w:sz w:val="20"/>
+          <w:szCs w:val="20"/>
+        </w:rPr>
+        <w:t xml:space="preserve">0009</w:t>
+      </w:r>
+      <w:r>
+        <w:t xml:space="preserve"> in the Supabase SQL Editor, in order. Run 0007 together with the matching frontend deploy — it changes the administer_treatment signature. 0009 is configuration-only (no deploy-ordering concern).  </w:t>
       </w:r>
       <w:r>
         <w:rPr>
           <w:color w:val="2C5F2D"/>
         </w:rPr>
-        <w:t xml:space="preserve">[done — all seven confirmed live]</w:t>
+        <w:t xml:space="preserve">[done — all eight confirmed live]</w:t>
       </w:r>
     </w:p>
     <w:p>
@@ -4746,7 +5221,7 @@
                 <w:sz w:val="20"/>
                 <w:szCs w:val="20"/>
               </w:rPr>
-              <w:t xml:space="preserve">4e05204</w:t>
+              <w:t xml:space="preserve">929ef71</w:t>
             </w:r>
           </w:p>
         </w:tc>
@@ -4771,7 +5246,7 @@
                 <w:sz w:val="22"/>
                 <w:szCs w:val="22"/>
               </w:rPr>
-              <w:t xml:space="preserve">Collapse the add-stock form on /medicine and /feed behind an “Add” disclosure; show the inventory first (open by default only when empty)</w:t>
+              <w:t xml:space="preserve">Collapse the nav into a single Menu trigger under the farm name</w:t>
             </w:r>
           </w:p>
         </w:tc>
@@ -4802,7 +5277,7 @@
                 <w:sz w:val="20"/>
                 <w:szCs w:val="20"/>
               </w:rPr>
-              <w:t xml:space="preserve">3998f15</w:t>
+              <w:t xml:space="preserve">2e44c8e</w:t>
             </w:r>
           </w:p>
         </w:tc>
@@ -4827,7 +5302,7 @@
                 <w:sz w:val="22"/>
                 <w:szCs w:val="22"/>
               </w:rPr>
-              <w:t xml:space="preserve">Add a health-event detail page (/health-events/[id]) with treatments list + record-a-treatment; link from Recent activity and the timeline; extract DosageGuidance</w:t>
+              <w:t xml:space="preserve">Make the dashboard KPI cards clickable</w:t>
             </w:r>
           </w:p>
         </w:tc>
@@ -4858,7 +5333,7 @@
                 <w:sz w:val="20"/>
                 <w:szCs w:val="20"/>
               </w:rPr>
-              <w:t xml:space="preserve">f676129</w:t>
+              <w:t xml:space="preserve">8ef8877</w:t>
             </w:r>
           </w:p>
         </w:tc>
@@ -4883,7 +5358,7 @@
                 <w:sz w:val="22"/>
                 <w:szCs w:val="22"/>
               </w:rPr>
-              <w:t xml:space="preserve">Show label-based dosage guidance on each medicine suggestion (calc, verbatim label text, vet disclaimer)</w:t>
+              <w:t xml:space="preserve">Give Open health events and Vaccinations due their own pages</w:t>
             </w:r>
           </w:p>
         </w:tc>
@@ -4914,7 +5389,7 @@
                 <w:sz w:val="20"/>
                 <w:szCs w:val="20"/>
               </w:rPr>
-              <w:t xml:space="preserve">a6d2a24</w:t>
+              <w:t xml:space="preserve">a7e1355</w:t>
             </w:r>
           </w:p>
         </w:tc>
@@ -4939,7 +5414,7 @@
                 <w:sz w:val="22"/>
                 <w:szCs w:val="22"/>
               </w:rPr>
-              <w:t xml:space="preserve">Label estimated_weight_kg as a manual estimate; show it on the animal detail header</w:t>
+              <w:t xml:space="preserve">Fix stuck “Logging out...” state; enlarge the header wordmark</w:t>
             </w:r>
           </w:p>
         </w:tc>
@@ -4970,7 +5445,7 @@
                 <w:sz w:val="20"/>
                 <w:szCs w:val="20"/>
               </w:rPr>
-              <w:t xml:space="preserve">279376b</w:t>
+              <w:t xml:space="preserve">8d69216</w:t>
             </w:r>
           </w:p>
         </w:tc>
@@ -4995,7 +5470,7 @@
                 <w:sz w:val="22"/>
                 <w:szCs w:val="22"/>
               </w:rPr>
-              <w:t xml:space="preserve">Medicine dosing section copy: transcribed reference data, not a guess</w:t>
+              <w:t xml:space="preserve">Restyle the header wordmark as a watermark</w:t>
             </w:r>
           </w:p>
         </w:tc>
@@ -5026,7 +5501,7 @@
                 <w:sz w:val="20"/>
                 <w:szCs w:val="20"/>
               </w:rPr>
-              <w:t xml:space="preserve">6319229</w:t>
+              <w:t xml:space="preserve">fe03381</w:t>
             </w:r>
           </w:p>
         </w:tc>
@@ -5051,7 +5526,7 @@
                 <w:sz w:val="22"/>
                 <w:szCs w:val="22"/>
               </w:rPr>
-              <w:t xml:space="preserve">Wire the 0008 dosage fields into the medicine and animal forms</w:t>
+              <w:t xml:space="preserve">Turn the header wordmark into a solid boxed badge</w:t>
             </w:r>
           </w:p>
         </w:tc>
@@ -5082,7 +5557,7 @@
                 <w:sz w:val="20"/>
                 <w:szCs w:val="20"/>
               </w:rPr>
-              <w:t xml:space="preserve">c8d6c6f</w:t>
+              <w:t xml:space="preserve">5492280</w:t>
             </w:r>
           </w:p>
         </w:tc>
@@ -5107,7 +5582,7 @@
                 <w:sz w:val="22"/>
                 <w:szCs w:val="22"/>
               </w:rPr>
-              <w:t xml:space="preserve">Add migration 0008: medicine dosage reference fields + animal estimated_weight_kg</w:t>
+              <w:t xml:space="preserve">Move the palette to Soft Neutral + Accent</w:t>
             </w:r>
           </w:p>
         </w:tc>
@@ -5138,7 +5613,7 @@
                 <w:sz w:val="20"/>
                 <w:szCs w:val="20"/>
               </w:rPr>
-              <w:t xml:space="preserve">0ea2e0d</w:t>
+              <w:t xml:space="preserve">952f600</w:t>
             </w:r>
           </w:p>
         </w:tc>
@@ -5163,7 +5638,7 @@
                 <w:sz w:val="22"/>
                 <w:szCs w:val="22"/>
               </w:rPr>
-              <w:t xml:space="preserve">Millilitre treatment dosing (migration 0007) + pre-fill the vaccination form from the due list</w:t>
+              <w:t xml:space="preserve">Add a consistent “← Back” link to every top-level page</w:t>
             </w:r>
           </w:p>
         </w:tc>
@@ -5194,7 +5669,7 @@
                 <w:sz w:val="20"/>
                 <w:szCs w:val="20"/>
               </w:rPr>
-              <w:t xml:space="preserve">9564e89</w:t>
+              <w:t xml:space="preserve">858a6d0</w:t>
             </w:r>
           </w:p>
         </w:tc>
@@ -5219,7 +5694,7 @@
                 <w:sz w:val="22"/>
                 <w:szCs w:val="22"/>
               </w:rPr>
-              <w:t xml:space="preserve">void_sale: null-safe owner check (is distinct from)</w:t>
+              <w:t xml:space="preserve">Security audit: headers/CSP, pin function search_path, dependency updates</w:t>
             </w:r>
           </w:p>
         </w:tc>
@@ -5250,7 +5725,7 @@
                 <w:sz w:val="20"/>
                 <w:szCs w:val="20"/>
               </w:rPr>
-              <w:t xml:space="preserve">222a1f9</w:t>
+              <w:t xml:space="preserve">4e05204</w:t>
             </w:r>
           </w:p>
         </w:tc>
@@ -5275,7 +5750,7 @@
                 <w:sz w:val="22"/>
                 <w:szCs w:val="22"/>
               </w:rPr>
-              <w:t xml:space="preserve">Guard sales: one per animal, active-only, with a void_sale path (migration 0006)</w:t>
+              <w:t xml:space="preserve">Collapse the add-stock form on /medicine and /feed behind an “Add” disclosure; show the inventory first (open by default only when empty)</w:t>
             </w:r>
           </w:p>
         </w:tc>
@@ -5306,7 +5781,7 @@
                 <w:sz w:val="20"/>
                 <w:szCs w:val="20"/>
               </w:rPr>
-              <w:t xml:space="preserve">e038f1a</w:t>
+              <w:t xml:space="preserve">3998f15</w:t>
             </w:r>
           </w:p>
         </w:tc>
@@ -5331,7 +5806,7 @@
                 <w:sz w:val="22"/>
                 <w:szCs w:val="22"/>
               </w:rPr>
-              <w:t xml:space="preserve">Group the nav into function dropdown menus instead of a long scrolling row</w:t>
+              <w:t xml:space="preserve">Add a health-event detail page (/health-events/[id]) with treatments list + record-a-treatment; link from Recent activity and the timeline; extract DosageGuidance</w:t>
             </w:r>
           </w:p>
         </w:tc>
@@ -5362,7 +5837,7 @@
                 <w:sz w:val="20"/>
                 <w:szCs w:val="20"/>
               </w:rPr>
-              <w:t xml:space="preserve">151794d</w:t>
+              <w:t xml:space="preserve">f676129</w:t>
             </w:r>
           </w:p>
         </w:tc>
@@ -5387,7 +5862,7 @@
                 <w:sz w:val="22"/>
                 <w:szCs w:val="22"/>
               </w:rPr>
-              <w:t xml:space="preserve">Add a Financials report (owner-only) with period filter and PDF export</w:t>
+              <w:t xml:space="preserve">Show label-based dosage guidance on each medicine suggestion (calc, verbatim label text, vet disclaimer)</w:t>
             </w:r>
           </w:p>
         </w:tc>
@@ -5418,7 +5893,7 @@
                 <w:sz w:val="20"/>
                 <w:szCs w:val="20"/>
               </w:rPr>
-              <w:t xml:space="preserve">2fad6a9</w:t>
+              <w:t xml:space="preserve">a6d2a24</w:t>
             </w:r>
           </w:p>
         </w:tc>
@@ -5443,7 +5918,7 @@
                 <w:sz w:val="22"/>
                 <w:szCs w:val="22"/>
               </w:rPr>
-              <w:t xml:space="preserve">Polish UI; active-only animal count; type-or-pick fields (datalists); collapse recent activity; drop the dashboard Ubulimi heading</w:t>
+              <w:t xml:space="preserve">Label estimated_weight_kg as a manual estimate; show it on the animal detail header</w:t>
             </w:r>
           </w:p>
         </w:tc>
@@ -5474,7 +5949,7 @@
                 <w:sz w:val="20"/>
                 <w:szCs w:val="20"/>
               </w:rPr>
-              <w:t xml:space="preserve">2846b53</w:t>
+              <w:t xml:space="preserve">279376b</w:t>
             </w:r>
           </w:p>
         </w:tc>
@@ -5499,7 +5974,7 @@
                 <w:sz w:val="22"/>
                 <w:szCs w:val="22"/>
               </w:rPr>
-              <w:t xml:space="preserve">Add a Log out button to the app header</w:t>
+              <w:t xml:space="preserve">Medicine dosing section copy: transcribed reference data, not a guess</w:t>
             </w:r>
           </w:p>
         </w:tc>
@@ -5530,7 +6005,7 @@
                 <w:sz w:val="20"/>
                 <w:szCs w:val="20"/>
               </w:rPr>
-              <w:t xml:space="preserve">dff35ec</w:t>
+              <w:t xml:space="preserve">6319229</w:t>
             </w:r>
           </w:p>
         </w:tc>
@@ -5555,7 +6030,7 @@
                 <w:sz w:val="22"/>
                 <w:szCs w:val="22"/>
               </w:rPr>
-              <w:t xml:space="preserve">Collapse the vaccinations-due list behind a click on both views</w:t>
+              <w:t xml:space="preserve">Wire the 0008 dosage fields into the medicine and animal forms</w:t>
             </w:r>
           </w:p>
         </w:tc>
@@ -5586,7 +6061,7 @@
                 <w:sz w:val="20"/>
                 <w:szCs w:val="20"/>
               </w:rPr>
-              <w:t xml:space="preserve">4dc70ba</w:t>
+              <w:t xml:space="preserve">c8d6c6f</w:t>
             </w:r>
           </w:p>
         </w:tc>
@@ -5611,7 +6086,7 @@
                 <w:sz w:val="22"/>
                 <w:szCs w:val="22"/>
               </w:rPr>
-              <w:t xml:space="preserve">Add optional one-tap demo login (owner / worker) to the login screen</w:t>
+              <w:t xml:space="preserve">Add migration 0008: medicine dosage reference fields + animal estimated_weight_kg</w:t>
             </w:r>
           </w:p>
         </w:tc>
@@ -5642,7 +6117,7 @@
                 <w:sz w:val="20"/>
                 <w:szCs w:val="20"/>
               </w:rPr>
-              <w:t xml:space="preserve">e1d3e29</w:t>
+              <w:t xml:space="preserve">0ea2e0d</w:t>
             </w:r>
           </w:p>
         </w:tc>
@@ -5667,7 +6142,7 @@
                 <w:sz w:val="22"/>
                 <w:szCs w:val="22"/>
               </w:rPr>
-              <w:t xml:space="preserve">Add a Download Report PDF on the animal history page (@react-pdf/renderer, client-side, code-split)</w:t>
+              <w:t xml:space="preserve">Millilitre treatment dosing (migration 0007) + pre-fill the vaccination form from the due list</w:t>
             </w:r>
           </w:p>
         </w:tc>
@@ -5698,7 +6173,7 @@
                 <w:sz w:val="20"/>
                 <w:szCs w:val="20"/>
               </w:rPr>
-              <w:t xml:space="preserve">f5a2cc3</w:t>
+              <w:t xml:space="preserve">9564e89</w:t>
             </w:r>
           </w:p>
         </w:tc>
@@ -5723,7 +6198,7 @@
                 <w:sz w:val="22"/>
                 <w:szCs w:val="22"/>
               </w:rPr>
-              <w:t xml:space="preserve">Exclude sold animals from the health-event and vaccination pickers</w:t>
+              <w:t xml:space="preserve">void_sale: null-safe owner check (is distinct from)</w:t>
             </w:r>
           </w:p>
         </w:tc>
@@ -5754,7 +6229,7 @@
                 <w:sz w:val="20"/>
                 <w:szCs w:val="20"/>
               </w:rPr>
-              <w:t xml:space="preserve">d24aa0b</w:t>
+              <w:t xml:space="preserve">222a1f9</w:t>
             </w:r>
           </w:p>
         </w:tc>
@@ -5779,7 +6254,7 @@
                 <w:sz w:val="22"/>
                 <w:szCs w:val="22"/>
               </w:rPr>
-              <w:t xml:space="preserve">Wire RecordSaleForm to the record_sale() rpc (also marks the animal sold)</w:t>
+              <w:t xml:space="preserve">Guard sales: one per animal, active-only, with a void_sale path (migration 0006)</w:t>
             </w:r>
           </w:p>
         </w:tc>
@@ -5810,7 +6285,7 @@
                 <w:sz w:val="20"/>
                 <w:szCs w:val="20"/>
               </w:rPr>
-              <w:t xml:space="preserve">08ea502</w:t>
+              <w:t xml:space="preserve">e038f1a</w:t>
             </w:r>
           </w:p>
         </w:tc>
@@ -5835,7 +6310,7 @@
                 <w:sz w:val="22"/>
                 <w:szCs w:val="22"/>
               </w:rPr>
-              <w:t xml:space="preserve">Add the record_sale() migration (0005)</w:t>
+              <w:t xml:space="preserve">Group the nav into function dropdown menus instead of a long scrolling row</w:t>
             </w:r>
           </w:p>
         </w:tc>
@@ -5866,7 +6341,7 @@
                 <w:sz w:val="20"/>
                 <w:szCs w:val="20"/>
               </w:rPr>
-              <w:t xml:space="preserve">a54c1ab</w:t>
+              <w:t xml:space="preserve">151794d</w:t>
             </w:r>
           </w:p>
         </w:tc>
@@ -5891,7 +6366,7 @@
                 <w:sz w:val="22"/>
                 <w:szCs w:val="22"/>
               </w:rPr>
-              <w:t xml:space="preserve">Add a persistent home link (sticky header) to every authenticated screen</w:t>
+              <w:t xml:space="preserve">Add a Financials report (owner-only) with period filter and PDF export</w:t>
             </w:r>
           </w:p>
         </w:tc>
@@ -5922,7 +6397,7 @@
                 <w:sz w:val="20"/>
                 <w:szCs w:val="20"/>
               </w:rPr>
-              <w:t xml:space="preserve">0232c69</w:t>
+              <w:t xml:space="preserve">2fad6a9</w:t>
             </w:r>
           </w:p>
         </w:tc>
@@ -5947,7 +6422,7 @@
                 <w:sz w:val="22"/>
                 <w:szCs w:val="22"/>
               </w:rPr>
-              <w:t xml:space="preserve">Clean up Sprint 0 placeholders — real restock-threshold low-stock check, “vaccinations due this week” card, worker today page reworked as a task list, due cards link to logging</w:t>
+              <w:t xml:space="preserve">Polish UI; active-only animal count; type-or-pick fields (datalists); collapse recent activity; drop the dashboard Ubulimi heading</w:t>
             </w:r>
           </w:p>
         </w:tc>
@@ -5978,7 +6453,7 @@
                 <w:sz w:val="20"/>
                 <w:szCs w:val="20"/>
               </w:rPr>
-              <w:t xml:space="preserve">9bdd2d7</w:t>
+              <w:t xml:space="preserve">2846b53</w:t>
             </w:r>
           </w:p>
         </w:tc>
@@ -6003,7 +6478,7 @@
                 <w:sz w:val="22"/>
                 <w:szCs w:val="22"/>
               </w:rPr>
-              <w:t xml:space="preserve">Add animal history timeline and owner-only Record Sale (history_snapshot JSON capture)</w:t>
+              <w:t xml:space="preserve">Add a Log out button to the app header</w:t>
             </w:r>
           </w:p>
         </w:tc>
@@ -6034,7 +6509,7 @@
                 <w:sz w:val="20"/>
                 <w:szCs w:val="20"/>
               </w:rPr>
-              <w:t xml:space="preserve">d6ad83d</w:t>
+              <w:t xml:space="preserve">dff35ec</w:t>
             </w:r>
           </w:p>
         </w:tc>
@@ -6059,7 +6534,7 @@
                 <w:sz w:val="22"/>
                 <w:szCs w:val="22"/>
               </w:rPr>
-              <w:t xml:space="preserve">Add feed inventory and a camp-scoped feeding log (log_feeding_event)</w:t>
+              <w:t xml:space="preserve">Collapse the vaccinations-due list behind a click on both views</w:t>
             </w:r>
           </w:p>
         </w:tc>
@@ -6090,7 +6565,7 @@
                 <w:sz w:val="20"/>
                 <w:szCs w:val="20"/>
               </w:rPr>
-              <w:t xml:space="preserve">12e2673</w:t>
+              <w:t xml:space="preserve">4dc70ba</w:t>
             </w:r>
           </w:p>
         </w:tc>
@@ -6115,7 +6590,7 @@
                 <w:sz w:val="22"/>
                 <w:szCs w:val="22"/>
               </w:rPr>
-              <w:t xml:space="preserve">Add vaccination types, vaccination logging, and a due/overdue list (administer_vaccination, vaccinations_due)</w:t>
+              <w:t xml:space="preserve">Add optional one-tap demo login (owner / worker) to the login screen</w:t>
             </w:r>
           </w:p>
         </w:tc>
@@ -6146,7 +6621,7 @@
                 <w:sz w:val="20"/>
                 <w:szCs w:val="20"/>
               </w:rPr>
-              <w:t xml:space="preserve">7cfbb12</w:t>
+              <w:t xml:space="preserve">e1d3e29</w:t>
             </w:r>
           </w:p>
         </w:tc>
@@ -6171,7 +6646,7 @@
                 <w:sz w:val="22"/>
                 <w:szCs w:val="22"/>
               </w:rPr>
-              <w:t xml:space="preserve">Add health event logging with medicine suggestions (/log-event, administer_treatment)</w:t>
+              <w:t xml:space="preserve">Add a Download Report PDF on the animal history page (@react-pdf/renderer, client-side, code-split)</w:t>
             </w:r>
           </w:p>
         </w:tc>
@@ -6202,7 +6677,7 @@
                 <w:sz w:val="20"/>
                 <w:szCs w:val="20"/>
               </w:rPr>
-              <w:t xml:space="preserve">42d5dc2</w:t>
+              <w:t xml:space="preserve">f5a2cc3</w:t>
             </w:r>
           </w:p>
         </w:tc>
@@ -6227,7 +6702,7 @@
                 <w:sz w:val="22"/>
                 <w:szCs w:val="22"/>
               </w:rPr>
-              <w:t xml:space="preserve">Harden the medicine form against duplicate / malformed entries</w:t>
+              <w:t xml:space="preserve">Exclude sold animals from the health-event and vaccination pickers</w:t>
             </w:r>
           </w:p>
         </w:tc>
@@ -6258,7 +6733,7 @@
                 <w:sz w:val="20"/>
                 <w:szCs w:val="20"/>
               </w:rPr>
-              <w:t xml:space="preserve">ea103b9</w:t>
+              <w:t xml:space="preserve">d24aa0b</w:t>
             </w:r>
           </w:p>
         </w:tc>
@@ -6283,7 +6758,7 @@
                 <w:sz w:val="22"/>
                 <w:szCs w:val="22"/>
               </w:rPr>
-              <w:t xml:space="preserve">Add medicine inventory (/medicine) with owner-only cost fields</w:t>
+              <w:t xml:space="preserve">Wire RecordSaleForm to the record_sale() rpc (also marks the animal sold)</w:t>
             </w:r>
           </w:p>
         </w:tc>
@@ -6314,7 +6789,7 @@
                 <w:sz w:val="20"/>
                 <w:szCs w:val="20"/>
               </w:rPr>
-              <w:t xml:space="preserve">91c9103</w:t>
+              <w:t xml:space="preserve">08ea502</w:t>
             </w:r>
           </w:p>
         </w:tc>
@@ -6339,7 +6814,7 @@
                 <w:sz w:val="22"/>
                 <w:szCs w:val="22"/>
               </w:rPr>
-              <w:t xml:space="preserve">Add animal registry (camps + animals CRUD)</w:t>
+              <w:t xml:space="preserve">Add the record_sale() migration (0005)</w:t>
             </w:r>
           </w:p>
         </w:tc>
@@ -6370,6 +6845,510 @@
                 <w:sz w:val="20"/>
                 <w:szCs w:val="20"/>
               </w:rPr>
+              <w:t xml:space="preserve">a54c1ab</w:t>
+            </w:r>
+          </w:p>
+        </w:tc>
+        <w:tc>
+          <w:tcPr>
+            <w:tcW w:type="dxa" w:w="7620"/>
+            <w:tcMar>
+              <w:top w:type="dxa" w:w="60"/>
+              <w:left w:type="dxa" w:w="100"/>
+              <w:bottom w:type="dxa" w:w="60"/>
+              <w:right w:type="dxa" w:w="100"/>
+            </w:tcMar>
+          </w:tcPr>
+          <w:p>
+            <w:pPr>
+              <w:spacing w:after="0"/>
+            </w:pPr>
+            <w:r>
+              <w:rPr>
+                <w:b w:val="false"/>
+                <w:bCs w:val="false"/>
+                <w:sz w:val="22"/>
+                <w:szCs w:val="22"/>
+              </w:rPr>
+              <w:t xml:space="preserve">Add a persistent home link (sticky header) to every authenticated screen</w:t>
+            </w:r>
+          </w:p>
+        </w:tc>
+      </w:tr>
+      <w:tr>
+        <w:trPr>
+          <w:tblHeader w:val="false"/>
+        </w:trPr>
+        <w:tc>
+          <w:tcPr>
+            <w:tcW w:type="dxa" w:w="1400"/>
+            <w:tcMar>
+              <w:top w:type="dxa" w:w="60"/>
+              <w:left w:type="dxa" w:w="100"/>
+              <w:bottom w:type="dxa" w:w="60"/>
+              <w:right w:type="dxa" w:w="100"/>
+            </w:tcMar>
+          </w:tcPr>
+          <w:p>
+            <w:pPr>
+              <w:spacing w:after="0"/>
+            </w:pPr>
+            <w:r>
+              <w:rPr>
+                <w:rFonts w:ascii="Consolas" w:cs="Consolas" w:eastAsia="Consolas" w:hAnsi="Consolas"/>
+                <w:b w:val="false"/>
+                <w:bCs w:val="false"/>
+                <w:sz w:val="20"/>
+                <w:szCs w:val="20"/>
+              </w:rPr>
+              <w:t xml:space="preserve">0232c69</w:t>
+            </w:r>
+          </w:p>
+        </w:tc>
+        <w:tc>
+          <w:tcPr>
+            <w:tcW w:type="dxa" w:w="7620"/>
+            <w:tcMar>
+              <w:top w:type="dxa" w:w="60"/>
+              <w:left w:type="dxa" w:w="100"/>
+              <w:bottom w:type="dxa" w:w="60"/>
+              <w:right w:type="dxa" w:w="100"/>
+            </w:tcMar>
+          </w:tcPr>
+          <w:p>
+            <w:pPr>
+              <w:spacing w:after="0"/>
+            </w:pPr>
+            <w:r>
+              <w:rPr>
+                <w:b w:val="false"/>
+                <w:bCs w:val="false"/>
+                <w:sz w:val="22"/>
+                <w:szCs w:val="22"/>
+              </w:rPr>
+              <w:t xml:space="preserve">Clean up Sprint 0 placeholders — real restock-threshold low-stock check, “vaccinations due this week” card, worker today page reworked as a task list, due cards link to logging</w:t>
+            </w:r>
+          </w:p>
+        </w:tc>
+      </w:tr>
+      <w:tr>
+        <w:trPr>
+          <w:tblHeader w:val="false"/>
+        </w:trPr>
+        <w:tc>
+          <w:tcPr>
+            <w:tcW w:type="dxa" w:w="1400"/>
+            <w:tcMar>
+              <w:top w:type="dxa" w:w="60"/>
+              <w:left w:type="dxa" w:w="100"/>
+              <w:bottom w:type="dxa" w:w="60"/>
+              <w:right w:type="dxa" w:w="100"/>
+            </w:tcMar>
+          </w:tcPr>
+          <w:p>
+            <w:pPr>
+              <w:spacing w:after="0"/>
+            </w:pPr>
+            <w:r>
+              <w:rPr>
+                <w:rFonts w:ascii="Consolas" w:cs="Consolas" w:eastAsia="Consolas" w:hAnsi="Consolas"/>
+                <w:b w:val="false"/>
+                <w:bCs w:val="false"/>
+                <w:sz w:val="20"/>
+                <w:szCs w:val="20"/>
+              </w:rPr>
+              <w:t xml:space="preserve">9bdd2d7</w:t>
+            </w:r>
+          </w:p>
+        </w:tc>
+        <w:tc>
+          <w:tcPr>
+            <w:tcW w:type="dxa" w:w="7620"/>
+            <w:tcMar>
+              <w:top w:type="dxa" w:w="60"/>
+              <w:left w:type="dxa" w:w="100"/>
+              <w:bottom w:type="dxa" w:w="60"/>
+              <w:right w:type="dxa" w:w="100"/>
+            </w:tcMar>
+          </w:tcPr>
+          <w:p>
+            <w:pPr>
+              <w:spacing w:after="0"/>
+            </w:pPr>
+            <w:r>
+              <w:rPr>
+                <w:b w:val="false"/>
+                <w:bCs w:val="false"/>
+                <w:sz w:val="22"/>
+                <w:szCs w:val="22"/>
+              </w:rPr>
+              <w:t xml:space="preserve">Add animal history timeline and owner-only Record Sale (history_snapshot JSON capture)</w:t>
+            </w:r>
+          </w:p>
+        </w:tc>
+      </w:tr>
+      <w:tr>
+        <w:trPr>
+          <w:tblHeader w:val="false"/>
+        </w:trPr>
+        <w:tc>
+          <w:tcPr>
+            <w:tcW w:type="dxa" w:w="1400"/>
+            <w:tcMar>
+              <w:top w:type="dxa" w:w="60"/>
+              <w:left w:type="dxa" w:w="100"/>
+              <w:bottom w:type="dxa" w:w="60"/>
+              <w:right w:type="dxa" w:w="100"/>
+            </w:tcMar>
+          </w:tcPr>
+          <w:p>
+            <w:pPr>
+              <w:spacing w:after="0"/>
+            </w:pPr>
+            <w:r>
+              <w:rPr>
+                <w:rFonts w:ascii="Consolas" w:cs="Consolas" w:eastAsia="Consolas" w:hAnsi="Consolas"/>
+                <w:b w:val="false"/>
+                <w:bCs w:val="false"/>
+                <w:sz w:val="20"/>
+                <w:szCs w:val="20"/>
+              </w:rPr>
+              <w:t xml:space="preserve">d6ad83d</w:t>
+            </w:r>
+          </w:p>
+        </w:tc>
+        <w:tc>
+          <w:tcPr>
+            <w:tcW w:type="dxa" w:w="7620"/>
+            <w:tcMar>
+              <w:top w:type="dxa" w:w="60"/>
+              <w:left w:type="dxa" w:w="100"/>
+              <w:bottom w:type="dxa" w:w="60"/>
+              <w:right w:type="dxa" w:w="100"/>
+            </w:tcMar>
+          </w:tcPr>
+          <w:p>
+            <w:pPr>
+              <w:spacing w:after="0"/>
+            </w:pPr>
+            <w:r>
+              <w:rPr>
+                <w:b w:val="false"/>
+                <w:bCs w:val="false"/>
+                <w:sz w:val="22"/>
+                <w:szCs w:val="22"/>
+              </w:rPr>
+              <w:t xml:space="preserve">Add feed inventory and a camp-scoped feeding log (log_feeding_event)</w:t>
+            </w:r>
+          </w:p>
+        </w:tc>
+      </w:tr>
+      <w:tr>
+        <w:trPr>
+          <w:tblHeader w:val="false"/>
+        </w:trPr>
+        <w:tc>
+          <w:tcPr>
+            <w:tcW w:type="dxa" w:w="1400"/>
+            <w:tcMar>
+              <w:top w:type="dxa" w:w="60"/>
+              <w:left w:type="dxa" w:w="100"/>
+              <w:bottom w:type="dxa" w:w="60"/>
+              <w:right w:type="dxa" w:w="100"/>
+            </w:tcMar>
+          </w:tcPr>
+          <w:p>
+            <w:pPr>
+              <w:spacing w:after="0"/>
+            </w:pPr>
+            <w:r>
+              <w:rPr>
+                <w:rFonts w:ascii="Consolas" w:cs="Consolas" w:eastAsia="Consolas" w:hAnsi="Consolas"/>
+                <w:b w:val="false"/>
+                <w:bCs w:val="false"/>
+                <w:sz w:val="20"/>
+                <w:szCs w:val="20"/>
+              </w:rPr>
+              <w:t xml:space="preserve">12e2673</w:t>
+            </w:r>
+          </w:p>
+        </w:tc>
+        <w:tc>
+          <w:tcPr>
+            <w:tcW w:type="dxa" w:w="7620"/>
+            <w:tcMar>
+              <w:top w:type="dxa" w:w="60"/>
+              <w:left w:type="dxa" w:w="100"/>
+              <w:bottom w:type="dxa" w:w="60"/>
+              <w:right w:type="dxa" w:w="100"/>
+            </w:tcMar>
+          </w:tcPr>
+          <w:p>
+            <w:pPr>
+              <w:spacing w:after="0"/>
+            </w:pPr>
+            <w:r>
+              <w:rPr>
+                <w:b w:val="false"/>
+                <w:bCs w:val="false"/>
+                <w:sz w:val="22"/>
+                <w:szCs w:val="22"/>
+              </w:rPr>
+              <w:t xml:space="preserve">Add vaccination types, vaccination logging, and a due/overdue list (administer_vaccination, vaccinations_due)</w:t>
+            </w:r>
+          </w:p>
+        </w:tc>
+      </w:tr>
+      <w:tr>
+        <w:trPr>
+          <w:tblHeader w:val="false"/>
+        </w:trPr>
+        <w:tc>
+          <w:tcPr>
+            <w:tcW w:type="dxa" w:w="1400"/>
+            <w:tcMar>
+              <w:top w:type="dxa" w:w="60"/>
+              <w:left w:type="dxa" w:w="100"/>
+              <w:bottom w:type="dxa" w:w="60"/>
+              <w:right w:type="dxa" w:w="100"/>
+            </w:tcMar>
+          </w:tcPr>
+          <w:p>
+            <w:pPr>
+              <w:spacing w:after="0"/>
+            </w:pPr>
+            <w:r>
+              <w:rPr>
+                <w:rFonts w:ascii="Consolas" w:cs="Consolas" w:eastAsia="Consolas" w:hAnsi="Consolas"/>
+                <w:b w:val="false"/>
+                <w:bCs w:val="false"/>
+                <w:sz w:val="20"/>
+                <w:szCs w:val="20"/>
+              </w:rPr>
+              <w:t xml:space="preserve">7cfbb12</w:t>
+            </w:r>
+          </w:p>
+        </w:tc>
+        <w:tc>
+          <w:tcPr>
+            <w:tcW w:type="dxa" w:w="7620"/>
+            <w:tcMar>
+              <w:top w:type="dxa" w:w="60"/>
+              <w:left w:type="dxa" w:w="100"/>
+              <w:bottom w:type="dxa" w:w="60"/>
+              <w:right w:type="dxa" w:w="100"/>
+            </w:tcMar>
+          </w:tcPr>
+          <w:p>
+            <w:pPr>
+              <w:spacing w:after="0"/>
+            </w:pPr>
+            <w:r>
+              <w:rPr>
+                <w:b w:val="false"/>
+                <w:bCs w:val="false"/>
+                <w:sz w:val="22"/>
+                <w:szCs w:val="22"/>
+              </w:rPr>
+              <w:t xml:space="preserve">Add health event logging with medicine suggestions (/log-event, administer_treatment)</w:t>
+            </w:r>
+          </w:p>
+        </w:tc>
+      </w:tr>
+      <w:tr>
+        <w:trPr>
+          <w:tblHeader w:val="false"/>
+        </w:trPr>
+        <w:tc>
+          <w:tcPr>
+            <w:tcW w:type="dxa" w:w="1400"/>
+            <w:tcMar>
+              <w:top w:type="dxa" w:w="60"/>
+              <w:left w:type="dxa" w:w="100"/>
+              <w:bottom w:type="dxa" w:w="60"/>
+              <w:right w:type="dxa" w:w="100"/>
+            </w:tcMar>
+          </w:tcPr>
+          <w:p>
+            <w:pPr>
+              <w:spacing w:after="0"/>
+            </w:pPr>
+            <w:r>
+              <w:rPr>
+                <w:rFonts w:ascii="Consolas" w:cs="Consolas" w:eastAsia="Consolas" w:hAnsi="Consolas"/>
+                <w:b w:val="false"/>
+                <w:bCs w:val="false"/>
+                <w:sz w:val="20"/>
+                <w:szCs w:val="20"/>
+              </w:rPr>
+              <w:t xml:space="preserve">42d5dc2</w:t>
+            </w:r>
+          </w:p>
+        </w:tc>
+        <w:tc>
+          <w:tcPr>
+            <w:tcW w:type="dxa" w:w="7620"/>
+            <w:tcMar>
+              <w:top w:type="dxa" w:w="60"/>
+              <w:left w:type="dxa" w:w="100"/>
+              <w:bottom w:type="dxa" w:w="60"/>
+              <w:right w:type="dxa" w:w="100"/>
+            </w:tcMar>
+          </w:tcPr>
+          <w:p>
+            <w:pPr>
+              <w:spacing w:after="0"/>
+            </w:pPr>
+            <w:r>
+              <w:rPr>
+                <w:b w:val="false"/>
+                <w:bCs w:val="false"/>
+                <w:sz w:val="22"/>
+                <w:szCs w:val="22"/>
+              </w:rPr>
+              <w:t xml:space="preserve">Harden the medicine form against duplicate / malformed entries</w:t>
+            </w:r>
+          </w:p>
+        </w:tc>
+      </w:tr>
+      <w:tr>
+        <w:trPr>
+          <w:tblHeader w:val="false"/>
+        </w:trPr>
+        <w:tc>
+          <w:tcPr>
+            <w:tcW w:type="dxa" w:w="1400"/>
+            <w:tcMar>
+              <w:top w:type="dxa" w:w="60"/>
+              <w:left w:type="dxa" w:w="100"/>
+              <w:bottom w:type="dxa" w:w="60"/>
+              <w:right w:type="dxa" w:w="100"/>
+            </w:tcMar>
+          </w:tcPr>
+          <w:p>
+            <w:pPr>
+              <w:spacing w:after="0"/>
+            </w:pPr>
+            <w:r>
+              <w:rPr>
+                <w:rFonts w:ascii="Consolas" w:cs="Consolas" w:eastAsia="Consolas" w:hAnsi="Consolas"/>
+                <w:b w:val="false"/>
+                <w:bCs w:val="false"/>
+                <w:sz w:val="20"/>
+                <w:szCs w:val="20"/>
+              </w:rPr>
+              <w:t xml:space="preserve">ea103b9</w:t>
+            </w:r>
+          </w:p>
+        </w:tc>
+        <w:tc>
+          <w:tcPr>
+            <w:tcW w:type="dxa" w:w="7620"/>
+            <w:tcMar>
+              <w:top w:type="dxa" w:w="60"/>
+              <w:left w:type="dxa" w:w="100"/>
+              <w:bottom w:type="dxa" w:w="60"/>
+              <w:right w:type="dxa" w:w="100"/>
+            </w:tcMar>
+          </w:tcPr>
+          <w:p>
+            <w:pPr>
+              <w:spacing w:after="0"/>
+            </w:pPr>
+            <w:r>
+              <w:rPr>
+                <w:b w:val="false"/>
+                <w:bCs w:val="false"/>
+                <w:sz w:val="22"/>
+                <w:szCs w:val="22"/>
+              </w:rPr>
+              <w:t xml:space="preserve">Add medicine inventory (/medicine) with owner-only cost fields</w:t>
+            </w:r>
+          </w:p>
+        </w:tc>
+      </w:tr>
+      <w:tr>
+        <w:trPr>
+          <w:tblHeader w:val="false"/>
+        </w:trPr>
+        <w:tc>
+          <w:tcPr>
+            <w:tcW w:type="dxa" w:w="1400"/>
+            <w:tcMar>
+              <w:top w:type="dxa" w:w="60"/>
+              <w:left w:type="dxa" w:w="100"/>
+              <w:bottom w:type="dxa" w:w="60"/>
+              <w:right w:type="dxa" w:w="100"/>
+            </w:tcMar>
+          </w:tcPr>
+          <w:p>
+            <w:pPr>
+              <w:spacing w:after="0"/>
+            </w:pPr>
+            <w:r>
+              <w:rPr>
+                <w:rFonts w:ascii="Consolas" w:cs="Consolas" w:eastAsia="Consolas" w:hAnsi="Consolas"/>
+                <w:b w:val="false"/>
+                <w:bCs w:val="false"/>
+                <w:sz w:val="20"/>
+                <w:szCs w:val="20"/>
+              </w:rPr>
+              <w:t xml:space="preserve">91c9103</w:t>
+            </w:r>
+          </w:p>
+        </w:tc>
+        <w:tc>
+          <w:tcPr>
+            <w:tcW w:type="dxa" w:w="7620"/>
+            <w:tcMar>
+              <w:top w:type="dxa" w:w="60"/>
+              <w:left w:type="dxa" w:w="100"/>
+              <w:bottom w:type="dxa" w:w="60"/>
+              <w:right w:type="dxa" w:w="100"/>
+            </w:tcMar>
+          </w:tcPr>
+          <w:p>
+            <w:pPr>
+              <w:spacing w:after="0"/>
+            </w:pPr>
+            <w:r>
+              <w:rPr>
+                <w:b w:val="false"/>
+                <w:bCs w:val="false"/>
+                <w:sz w:val="22"/>
+                <w:szCs w:val="22"/>
+              </w:rPr>
+              <w:t xml:space="preserve">Add animal registry (camps + animals CRUD)</w:t>
+            </w:r>
+          </w:p>
+        </w:tc>
+      </w:tr>
+      <w:tr>
+        <w:trPr>
+          <w:tblHeader w:val="false"/>
+        </w:trPr>
+        <w:tc>
+          <w:tcPr>
+            <w:tcW w:type="dxa" w:w="1400"/>
+            <w:tcMar>
+              <w:top w:type="dxa" w:w="60"/>
+              <w:left w:type="dxa" w:w="100"/>
+              <w:bottom w:type="dxa" w:w="60"/>
+              <w:right w:type="dxa" w:w="100"/>
+            </w:tcMar>
+          </w:tcPr>
+          <w:p>
+            <w:pPr>
+              <w:spacing w:after="0"/>
+            </w:pPr>
+            <w:r>
+              <w:rPr>
+                <w:rFonts w:ascii="Consolas" w:cs="Consolas" w:eastAsia="Consolas" w:hAnsi="Consolas"/>
+                <w:b w:val="false"/>
+                <w:bCs w:val="false"/>
+                <w:sz w:val="20"/>
+                <w:szCs w:val="20"/>
+              </w:rPr>
               <w:t xml:space="preserve">9ab30fa</w:t>
             </w:r>
           </w:p>
@@ -6424,7 +7403,7 @@
           <w:b/>
           <w:bCs/>
         </w:rPr>
-        <w:t xml:space="preserve">Verified (10 Sep 2026): </w:t>
+        <w:t xml:space="preserve">Verified (17 Sep 2026): </w:t>
       </w:r>
       <w:r>
         <w:rPr>
@@ -6446,7 +7425,7 @@
         <w:t xml:space="preserve">npm audit</w:t>
       </w:r>
       <w:r>
-        <w:t xml:space="preserve"> reports 0 vulnerabilities; the five RPC functions (administer_treatment with the new p_dose_ml signature, administer_vaccination, log_feeding_event, record_sale, void_sale), the vaccinations_due view, and the 0008 columns are live in the project database (API probe); ubulimi.vercel.app returns HTTP 200; git main is level with origin.</w:t>
+        <w:t xml:space="preserve"> reports 0 vulnerabilities; response headers (CSP, X-Frame-Options, X-Content-Type-Options, Referrer-Policy, Permissions-Policy, HSTS) confirmed present on ubulimi.vercel.app by curl, with no X-Powered-By; all 8 SECURITY DEFINER functions re-exercised live on production after migration 0009 with no errors; ubulimi.vercel.app returns HTTP 200; git main is level with origin.</w:t>
       </w:r>
     </w:p>
     <w:p>
@@ -6466,7 +7445,7 @@
         <w:t xml:space="preserve">Tested live on production (demo Owner / Worker on ubulimi.vercel.app): </w:t>
       </w:r>
       <w:r>
-        <w:t xml:space="preserve">grouped nav; Financials period switching + PDF; a feeding decrements feed stock; Remove sale (void_sale) deletes the sale and reactivates the animal, then a fresh sale re-marks it sold; a deceased / culled animal shows the “fix status first” note; a treatment dose of 500 ml against a medicine held in litres reduces stock by 0.5 L (1:1 when held in ml); the vaccinations-due link pre-selects animal + type; the dosage suggestion computes dose_per_kg × weight and always shows the vet disclaimer; the health-event page opens from Recent activity and the timeline, lists treatments given, records a new one, and toggles resolved / reopen; on /medicine and /feed the add form stays collapsed until the “Add” disclosure is clicked, with the inventory shown first. Demo data restored where practical.</w:t>
+        <w:t xml:space="preserve">grouped nav; Financials period switching + PDF; a feeding decrements feed stock; Remove sale (void_sale) deletes the sale and reactivates the animal, then a fresh sale re-marks it sold; a deceased / culled animal shows the “fix status first” note; a treatment dose of 500 ml against a medicine held in litres reduces stock by 0.5 L (1:1 when held in ml); the vaccinations-due link pre-selects animal + type; the dosage suggestion computes dose_per_kg × weight and always shows the vet disclaimer; the health-event page opens from Recent activity and the timeline, lists treatments given, records a new one, and toggles resolved / reopen; on /medicine and /feed the add form stays collapsed until the “Add” disclosure is clicked, with the inventory shown first; the single Menu button opens the grouped panel and every “← Back” link resolves correctly for both Owner and Worker; the four dashboard KPI cards navigate/link correctly; a post-migration-0009 pass re-recorded a treatment, a vaccination, a feeding, and a sale (then voided it) with no errors. Demo data restored where practical.</w:t>
       </w:r>
     </w:p>
     <w:p>
@@ -6544,7 +7523,7 @@
           <w:sz w:val="20"/>
           <w:szCs w:val="20"/>
         </w:rPr>
-        <w:t xml:space="preserve">4e05204</w:t>
+        <w:t xml:space="preserve">858a6d0</w:t>
       </w:r>
       <w:r>
         <w:t xml:space="preserve"> or newer) — Vercel dashboard → Deployments. It auto-deploys on push.</w:t>

</xml_diff>